<commit_message>
docs: agregar evidencia visual Swagger y app al informe de testing
</commit_message>
<xml_diff>
--- a/Downloads/Donaton-Informes-Valenzuela-Fuentes-Flores-/informe_testing_donaton.docx
+++ b/Downloads/Donaton-Informes-Valenzuela-Fuentes-Flores-/informe_testing_donaton.docx
@@ -22281,7 +22281,342 @@
           <w:sz w:val="32"/>
           <w:szCs w:val="32"/>
         </w:rPr>
-        <w:t xml:space="preserve">5. Conclusiones</w:t>
+        <w:t xml:space="preserve">5. Evidencia Visual del Sistema</w:t>
+      </w:r>
+    </w:p>
+    <w:p>
+      <w:pPr>
+        <w:spacing w:after="80" w:before="80"/>
+      </w:pPr>
+      <w:r>
+        <w:rPr>
+          <w:rFonts w:ascii="Arial" w:cs="Arial" w:eastAsia="Arial" w:hAnsi="Arial"/>
+          <w:color w:val="333333"/>
+          <w:sz w:val="20"/>
+          <w:szCs w:val="20"/>
+        </w:rPr>
+        <w:t xml:space="preserve">A continuación se presenta evidencia visual de los microservicios funcionando, incluyendo la documentación interactiva de endpoints generada por Swagger (OpenAPI 3.1) y la interfaz del frontend Donaton en operación.</w:t>
+      </w:r>
+    </w:p>
+    <w:p>
+      <w:pPr>
+        <w:pStyle w:val="Heading2"/>
+        <w:spacing w:after="120" w:before="240"/>
+      </w:pPr>
+      <w:r>
+        <w:rPr>
+          <w:rFonts w:ascii="Arial" w:cs="Arial" w:eastAsia="Arial" w:hAnsi="Arial"/>
+          <w:b/>
+          <w:bCs/>
+          <w:color w:val="2E4A7A"/>
+          <w:sz w:val="26"/>
+          <w:szCs w:val="26"/>
+        </w:rPr>
+        <w:t xml:space="preserve">5.1 Swagger — ms-donaciones (puerto 8082)</w:t>
+      </w:r>
+    </w:p>
+    <w:p>
+      <w:pPr>
+        <w:spacing w:after="60" w:before="60"/>
+      </w:pPr>
+      <w:r>
+        <w:rPr>
+          <w:rFonts w:ascii="Arial" w:cs="Arial" w:eastAsia="Arial" w:hAnsi="Arial"/>
+          <w:color w:val="333333"/>
+          <w:sz w:val="20"/>
+          <w:szCs w:val="20"/>
+        </w:rPr>
+        <w:t xml:space="preserve">El microservicio de donaciones expone 6 endpoints REST documentados con OpenAPI 3.1, accesibles en localhost:8082/swagger-ui/index.html. El controlador cubre el ciclo completo de una donación: registro (POST), consulta individual y masiva (GET), actualización de estado (PUT /{id}/estado) y asignación a una necesidad (PUT /{id}/asignar).</w:t>
+      </w:r>
+    </w:p>
+    <w:p>
+      <w:pPr>
+        <w:spacing w:after="120" w:before="120"/>
+        <w:jc w:val="center"/>
+      </w:pPr>
+      <w:r>
+        <w:drawing>
+          <wp:inline xmlns:wp="http://schemas.openxmlformats.org/drawingml/2006/wordprocessingDrawing">
+            <wp:extent cx="5943600" cy="3714750"/>
+            <wp:effectExtent b="0" l="0" r="0" t="0"/>
+            <wp:docPr id="1" name="swagger_donacion" descr="Swagger ms-donaciones"/>
+            <wp:cNvGraphicFramePr>
+              <a:graphicFrameLocks xmlns:a="http://schemas.openxmlformats.org/drawingml/2006/main" noChangeAspect="1"/>
+            </wp:cNvGraphicFramePr>
+            <a:graphic xmlns:a="http://schemas.openxmlformats.org/drawingml/2006/main">
+              <a:graphicData uri="http://schemas.openxmlformats.org/drawingml/2006/picture">
+                <pic:pic xmlns:pic="http://schemas.openxmlformats.org/drawingml/2006/picture">
+                  <pic:nvPicPr>
+                    <pic:cNvPr id="1" name="swagger_donacion"/>
+                    <pic:cNvPicPr/>
+                  </pic:nvPicPr>
+                  <pic:blipFill>
+                    <a:blip xmlns:r="http://schemas.openxmlformats.org/officeDocument/2006/relationships" r:embed="rId10"/>
+                    <a:stretch>
+                      <a:fillRect/>
+                    </a:stretch>
+                  </pic:blipFill>
+                  <pic:spPr>
+                    <a:xfrm>
+                      <a:off x="0" y="0"/>
+                      <a:ext cx="5943600" cy="3714750"/>
+                    </a:xfrm>
+                    <a:prstGeom prst="rect">
+                      <a:avLst/>
+                    </a:prstGeom>
+                  </pic:spPr>
+                </pic:pic>
+              </a:graphicData>
+            </a:graphic>
+          </wp:inline>
+        </w:drawing>
+      </w:r>
+    </w:p>
+    <w:p>
+      <w:pPr>
+        <w:pStyle w:val="Heading2"/>
+        <w:spacing w:after="120" w:before="240"/>
+      </w:pPr>
+      <w:r>
+        <w:rPr>
+          <w:rFonts w:ascii="Arial" w:cs="Arial" w:eastAsia="Arial" w:hAnsi="Arial"/>
+          <w:b/>
+          <w:bCs/>
+          <w:color w:val="2E4A7A"/>
+          <w:sz w:val="26"/>
+          <w:szCs w:val="26"/>
+        </w:rPr>
+        <w:t xml:space="preserve">5.2 Swagger — ms-usuarios (puerto 8085)</w:t>
+      </w:r>
+    </w:p>
+    <w:p>
+      <w:pPr>
+        <w:spacing w:after="60" w:before="60"/>
+      </w:pPr>
+      <w:r>
+        <w:rPr>
+          <w:rFonts w:ascii="Arial" w:cs="Arial" w:eastAsia="Arial" w:hAnsi="Arial"/>
+          <w:color w:val="333333"/>
+          <w:sz w:val="20"/>
+          <w:szCs w:val="20"/>
+        </w:rPr>
+        <w:t xml:space="preserve">El microservicio de usuarios expone endpoints de autenticación (/auth/login, /auth/registro), gestión CRUD completa de usuarios con soporte de roles (ADMIN, DONANTE, COORDINADOR, EMPRESA), activación/desactivación de cuentas y gestión de comunas. Accesible en localhost:8085/swagger-ui/index.html.</w:t>
+      </w:r>
+    </w:p>
+    <w:p>
+      <w:pPr>
+        <w:spacing w:after="120" w:before="120"/>
+        <w:jc w:val="center"/>
+      </w:pPr>
+      <w:r>
+        <w:drawing>
+          <wp:inline xmlns:wp="http://schemas.openxmlformats.org/drawingml/2006/wordprocessingDrawing">
+            <wp:extent cx="5943600" cy="3714750"/>
+            <wp:effectExtent b="0" l="0" r="0" t="0"/>
+            <wp:docPr id="2" name="swagger_usuario" descr="Swagger ms-usuarios"/>
+            <wp:cNvGraphicFramePr>
+              <a:graphicFrameLocks xmlns:a="http://schemas.openxmlformats.org/drawingml/2006/main" noChangeAspect="1"/>
+            </wp:cNvGraphicFramePr>
+            <a:graphic xmlns:a="http://schemas.openxmlformats.org/drawingml/2006/main">
+              <a:graphicData uri="http://schemas.openxmlformats.org/drawingml/2006/picture">
+                <pic:pic xmlns:pic="http://schemas.openxmlformats.org/drawingml/2006/picture">
+                  <pic:nvPicPr>
+                    <pic:cNvPr id="2" name="swagger_usuario"/>
+                    <pic:cNvPicPr/>
+                  </pic:nvPicPr>
+                  <pic:blipFill>
+                    <a:blip xmlns:r="http://schemas.openxmlformats.org/officeDocument/2006/relationships" r:embed="rId11"/>
+                    <a:stretch>
+                      <a:fillRect/>
+                    </a:stretch>
+                  </pic:blipFill>
+                  <pic:spPr>
+                    <a:xfrm>
+                      <a:off x="0" y="0"/>
+                      <a:ext cx="5943600" cy="3714750"/>
+                    </a:xfrm>
+                    <a:prstGeom prst="rect">
+                      <a:avLst/>
+                    </a:prstGeom>
+                  </pic:spPr>
+                </pic:pic>
+              </a:graphicData>
+            </a:graphic>
+          </wp:inline>
+        </w:drawing>
+      </w:r>
+    </w:p>
+    <w:p>
+      <w:pPr>
+        <w:pStyle w:val="Heading2"/>
+        <w:spacing w:after="120" w:before="240"/>
+      </w:pPr>
+      <w:r>
+        <w:rPr>
+          <w:rFonts w:ascii="Arial" w:cs="Arial" w:eastAsia="Arial" w:hAnsi="Arial"/>
+          <w:b/>
+          <w:bCs/>
+          <w:color w:val="2E4A7A"/>
+          <w:sz w:val="26"/>
+          <w:szCs w:val="26"/>
+        </w:rPr>
+        <w:t xml:space="preserve">5.3 Swagger — ms-necesidades (puerto 8084)</w:t>
+      </w:r>
+    </w:p>
+    <w:p>
+      <w:pPr>
+        <w:spacing w:after="60" w:before="60"/>
+      </w:pPr>
+      <w:r>
+        <w:rPr>
+          <w:rFonts w:ascii="Arial" w:cs="Arial" w:eastAsia="Arial" w:hAnsi="Arial"/>
+          <w:color w:val="333333"/>
+          <w:sz w:val="20"/>
+          <w:szCs w:val="20"/>
+        </w:rPr>
+        <w:t xml:space="preserve">El microservicio de necesidades permite registrar pedidos de donación con geolocalización, filtrarlos por estado, urgencia y categoría, y actualizarlos cuando se reciben recursos. La imagen muestra los endpoints disponibles en localhost:8084/swagger-ui/index.html, con soporte de filtros avanzados para coordinadores en terreno.</w:t>
+      </w:r>
+    </w:p>
+    <w:p>
+      <w:pPr>
+        <w:spacing w:after="120" w:before="120"/>
+        <w:jc w:val="center"/>
+      </w:pPr>
+      <w:r>
+        <w:drawing>
+          <wp:inline xmlns:wp="http://schemas.openxmlformats.org/drawingml/2006/wordprocessingDrawing">
+            <wp:extent cx="5943600" cy="3714750"/>
+            <wp:effectExtent b="0" l="0" r="0" t="0"/>
+            <wp:docPr id="3" name="swagger_necesidad" descr="Swagger ms-necesidades"/>
+            <wp:cNvGraphicFramePr>
+              <a:graphicFrameLocks xmlns:a="http://schemas.openxmlformats.org/drawingml/2006/main" noChangeAspect="1"/>
+            </wp:cNvGraphicFramePr>
+            <a:graphic xmlns:a="http://schemas.openxmlformats.org/drawingml/2006/main">
+              <a:graphicData uri="http://schemas.openxmlformats.org/drawingml/2006/picture">
+                <pic:pic xmlns:pic="http://schemas.openxmlformats.org/drawingml/2006/picture">
+                  <pic:nvPicPr>
+                    <pic:cNvPr id="3" name="swagger_necesidad"/>
+                    <pic:cNvPicPr/>
+                  </pic:nvPicPr>
+                  <pic:blipFill>
+                    <a:blip xmlns:r="http://schemas.openxmlformats.org/officeDocument/2006/relationships" r:embed="rId12"/>
+                    <a:stretch>
+                      <a:fillRect/>
+                    </a:stretch>
+                  </pic:blipFill>
+                  <pic:spPr>
+                    <a:xfrm>
+                      <a:off x="0" y="0"/>
+                      <a:ext cx="5943600" cy="3714750"/>
+                    </a:xfrm>
+                    <a:prstGeom prst="rect">
+                      <a:avLst/>
+                    </a:prstGeom>
+                  </pic:spPr>
+                </pic:pic>
+              </a:graphicData>
+            </a:graphic>
+          </wp:inline>
+        </w:drawing>
+      </w:r>
+    </w:p>
+    <w:p>
+      <w:pPr>
+        <w:pStyle w:val="Heading2"/>
+        <w:spacing w:after="120" w:before="240"/>
+      </w:pPr>
+      <w:r>
+        <w:rPr>
+          <w:rFonts w:ascii="Arial" w:cs="Arial" w:eastAsia="Arial" w:hAnsi="Arial"/>
+          <w:b/>
+          <w:bCs/>
+          <w:color w:val="2E4A7A"/>
+          <w:sz w:val="26"/>
+          <w:szCs w:val="26"/>
+        </w:rPr>
+        <w:t xml:space="preserve">5.4 Aplicación Donaton en Funcionamiento</w:t>
+      </w:r>
+    </w:p>
+    <w:p>
+      <w:pPr>
+        <w:spacing w:after="60" w:before="60"/>
+      </w:pPr>
+      <w:r>
+        <w:rPr>
+          <w:rFonts w:ascii="Arial" w:cs="Arial" w:eastAsia="Arial" w:hAnsi="Arial"/>
+          <w:color w:val="333333"/>
+          <w:sz w:val="20"/>
+          <w:szCs w:val="20"/>
+        </w:rPr>
+        <w:t xml:space="preserve">Pantalla de la vista “Pedidos de Donación” del frontend React (localhost:5173/necesidades) en sesión activa con rol DONANTE. Se observan los 3 pedidos registrados (“Alimentos urgentes”, “Medicamentos críticos” y “Leche para familias”), los filtros de búsqueda por categoría, urgencia y estado, y las tarjetas de resumen con el conteo de pedidos totales, críticos, pendientes y cubiertos. El sistema completo — backend y frontend — opera de manera integrada sobre la arquitectura de microservicios documentada en este informe.</w:t>
+      </w:r>
+    </w:p>
+    <w:p>
+      <w:pPr>
+        <w:spacing w:after="200" w:before="120"/>
+        <w:jc w:val="center"/>
+      </w:pPr>
+      <w:r>
+        <w:drawing>
+          <wp:inline xmlns:wp="http://schemas.openxmlformats.org/drawingml/2006/wordprocessingDrawing">
+            <wp:extent cx="5943600" cy="3714750"/>
+            <wp:effectExtent b="0" l="0" r="0" t="0"/>
+            <wp:docPr id="4" name="app_funcionando" descr="Aplicacion Donaton funcionando"/>
+            <wp:cNvGraphicFramePr>
+              <a:graphicFrameLocks xmlns:a="http://schemas.openxmlformats.org/drawingml/2006/main" noChangeAspect="1"/>
+            </wp:cNvGraphicFramePr>
+            <a:graphic xmlns:a="http://schemas.openxmlformats.org/drawingml/2006/main">
+              <a:graphicData uri="http://schemas.openxmlformats.org/drawingml/2006/picture">
+                <pic:pic xmlns:pic="http://schemas.openxmlformats.org/drawingml/2006/picture">
+                  <pic:nvPicPr>
+                    <pic:cNvPr id="4" name="app_funcionando"/>
+                    <pic:cNvPicPr/>
+                  </pic:nvPicPr>
+                  <pic:blipFill>
+                    <a:blip xmlns:r="http://schemas.openxmlformats.org/officeDocument/2006/relationships" r:embed="rId13"/>
+                    <a:stretch>
+                      <a:fillRect/>
+                    </a:stretch>
+                  </pic:blipFill>
+                  <pic:spPr>
+                    <a:xfrm>
+                      <a:off x="0" y="0"/>
+                      <a:ext cx="5943600" cy="3714750"/>
+                    </a:xfrm>
+                    <a:prstGeom prst="rect">
+                      <a:avLst/>
+                    </a:prstGeom>
+                  </pic:spPr>
+                </pic:pic>
+              </a:graphicData>
+            </a:graphic>
+          </wp:inline>
+        </w:drawing>
+      </w:r>
+    </w:p>
+    <w:p>
+      <w:pPr>
+        <w:spacing w:after="80" w:before="80"/>
+      </w:pPr>
+      <w:r>
+        <w:t xml:space="preserve"/>
+      </w:r>
+    </w:p>
+    <w:p>
+      <w:pPr>
+        <w:pStyle w:val="Heading1"/>
+        <w:spacing w:after="160" w:before="360"/>
+      </w:pPr>
+      <w:r>
+        <w:rPr>
+          <w:rFonts w:ascii="Arial" w:cs="Arial" w:eastAsia="Arial" w:hAnsi="Arial"/>
+          <w:b/>
+          <w:bCs/>
+          <w:color w:val="1A2744"/>
+          <w:sz w:val="32"/>
+          <w:szCs w:val="32"/>
+        </w:rPr>
+        <w:t xml:space="preserve">6. Conclusiones</w:t>
       </w:r>
     </w:p>
     <w:p>

</xml_diff>